<commit_message>
docs: sync AGENTS.md and developer-docs with v1.8.2 (ICE restart, quality indicator, ES, Telegram notification, build process)
</commit_message>
<xml_diff>
--- a/developer-docs/TV_Hamsters_Developer_Guide.docx
+++ b/developer-docs/TV_Hamsters_Developer_Guide.docx
@@ -28,7 +28,7 @@
         <w:jc w:val="center"/>
       </w:pPr>
       <w:r>
-        <w:t xml:space="preserve">Версия продукта: 1.7.2</w:t>
+        <w:t xml:space="preserve">Версия продукта: 1.8.2</w:t>
       </w:r>
     </w:p>
     <w:p>
@@ -53,7 +53,111 @@
         <w:spacing w:after="200"/>
       </w:pPr>
       <w:r>
-        <w:t xml:space="preserve">TV Hamsters — смотрите фильмы, сериалы и видео вместе, будто вы рядом. Один включает трансляцию экрана со звуком, остальные видят видео и слышат голоса всех участников. Можно обсуждать происходящее в реальном времени, хохотать и комментировать — как в настоящем кинотеатре, только онлайн.</w:t>
+        <w:t xml:space="preserve">TV Hamsters — смотрите фильмы, сериалы и видео вместе онлайн. Один включает трансляцию экрана со звуком, остальные видят видео и слышат голоса всех участников. Текстовый чат, реакции-эмодзи на весь экран, скример-пасхалка. Режим рации (Push-to-Talk). До 5 участников P2P mesh. i18n RU/EN/ES.</w:t>
+      </w:r>
+    </w:p>
+    <w:p>
+      <w:pPr>
+        <w:spacing w:after="300"/>
+      </w:pPr>
+      <w:r>
+        <w:t xml:space="preserve">Основные возможности: трансляция экрана со звуком (любое окно); видеозвонок с камерами всех участников; текстовый чат; emoji-реакции на весь экран; режим рации (Push-to-Talk); индикатор качества связи; скример-пасхалка в чате; плавающая панель управления при трансляции; окно камер участников (faces); ползунки громкости; i18n (RU/EN/ES); локальный (LAN) и облачный режимы.</w:t>
+      </w:r>
+    </w:p>
+    <w:p>
+      <w:pPr>
+        <w:pStyle w:val="Heading1"/>
+      </w:pPr>
+      <w:r>
+        <w:t xml:space="preserve">2. Технологии</w:t>
+      </w:r>
+    </w:p>
+    <w:p>
+      <w:pPr>
+        <w:pStyle w:val="Heading2"/>
+      </w:pPr>
+      <w:r>
+        <w:t xml:space="preserve">Стек:</w:t>
+      </w:r>
+    </w:p>
+    <w:p>
+      <w:pPr>
+        <w:spacing w:after="60"/>
+      </w:pPr>
+      <w:r>
+        <w:t xml:space="preserve">• Electron 34 — кросс-платформенная среда для десктопных приложений на веб-технологиях</w:t>
+      </w:r>
+    </w:p>
+    <w:p>
+      <w:pPr>
+        <w:spacing w:after="60"/>
+      </w:pPr>
+      <w:r>
+        <w:t xml:space="preserve">• Socket.IO 4 — двунаправленная связь в реальном времени (signalling)</w:t>
+      </w:r>
+    </w:p>
+    <w:p>
+      <w:pPr>
+        <w:spacing w:after="60"/>
+      </w:pPr>
+      <w:r>
+        <w:t xml:space="preserve">• WebRTC — передача видео/аудио/экрана (P2P, STUN, ICE restart)</w:t>
+      </w:r>
+    </w:p>
+    <w:p>
+      <w:pPr>
+        <w:spacing w:after="60"/>
+      </w:pPr>
+      <w:r>
+        <w:t xml:space="preserve">• getDisplayMedia — нативный захват экрана (Chromium)</w:t>
+      </w:r>
+    </w:p>
+    <w:p>
+      <w:pPr>
+        <w:spacing w:after="60"/>
+      </w:pPr>
+      <w:r>
+        <w:t xml:space="preserve">• nat-upnp — автоматическое открытие портов на роутере (для LAN режима)</w:t>
+      </w:r>
+    </w:p>
+    <w:p>
+      <w:pPr>
+        <w:spacing w:after="60"/>
+      </w:pPr>
+      <w:r>
+        <w:t xml:space="preserve">• Node.js v24 — среда выполнения JavaScript</w:t>
+      </w:r>
+    </w:p>
+    <w:p>
+      <w:pPr>
+        <w:spacing w:after="60"/>
+      </w:pPr>
+      <w:r>
+        <w:t xml:space="preserve">• electron-builder 25 — сборка портативного .exe</w:t>
+      </w:r>
+    </w:p>
+    <w:p>
+      <w:pPr>
+        <w:spacing w:after="60"/>
+      </w:pPr>
+      <w:r>
+        <w:t xml:space="preserve">• node-telegram-bot-api — Telegram бот (команды /room, /download)</w:t>
+      </w:r>
+    </w:p>
+    <w:p>
+      <w:pPr>
+        <w:spacing w:after="300"/>
+      </w:pPr>
+      <w:r>
+        <w:t xml:space="preserve">• docx — генерация этого документа</w:t>
+      </w:r>
+    </w:p>
+    <w:p>
+      <w:pPr>
+        <w:pStyle w:val="Heading1"/>
+      </w:pPr>
+      <w:r>
+        <w:t xml:space="preserve">3. Архитектура</w:t>
       </w:r>
     </w:p>
     <w:p>
@@ -61,103 +165,15 @@
         <w:spacing w:after="200"/>
       </w:pPr>
       <w:r>
-        <w:t xml:space="preserve">Режим рации (Push-to-Talk): правый клик по микрофону → режим PTT. Зажать Пробел или кнопку — говорить. Отпустить — микрофон выключится. Выход из PTT — любой клик (левой/правой) по иконке микрофона. В обычном режиме микрофон работает постоянно.</w:t>
-      </w:r>
-    </w:p>
-    <w:p>
-      <w:pPr>
-        <w:spacing w:after="300"/>
-      </w:pPr>
-      <w:r>
-        <w:t xml:space="preserve">Программа работает как через локальную сеть (LAN), так и через Интернет без необходимости настройки роутера. Для работы через Интернет используется облачный signalling-сервер на Render.com. Поддерживается до 5 участников в одной комнате.</w:t>
-      </w:r>
-    </w:p>
-    <w:p>
-      <w:pPr>
-        <w:pStyle w:val="Heading1"/>
-      </w:pPr>
-      <w:r>
-        <w:t xml:space="preserve">2. Технологии</w:t>
-      </w:r>
-    </w:p>
-    <w:p>
-      <w:pPr>
-        <w:pStyle w:val="Heading2"/>
-      </w:pPr>
-      <w:r>
-        <w:t xml:space="preserve">Стек:</w:t>
-      </w:r>
-    </w:p>
-    <w:p>
-      <w:pPr>
-        <w:spacing w:after="60"/>
-      </w:pPr>
-      <w:r>
-        <w:t xml:space="preserve">• Electron 34 — кросс-платформенная среда для десктопных приложений на веб-технологиях</w:t>
-      </w:r>
-    </w:p>
-    <w:p>
-      <w:pPr>
-        <w:spacing w:after="60"/>
-      </w:pPr>
-      <w:r>
-        <w:t xml:space="preserve">• Socket.IO 4 — двунаправленная связь в реальном времени (signalling)</w:t>
-      </w:r>
-    </w:p>
-    <w:p>
-      <w:pPr>
-        <w:spacing w:after="60"/>
-      </w:pPr>
-      <w:r>
-        <w:t xml:space="preserve">• WebRTC — передача видео/аудио/экрана (P2P, через STUN)</w:t>
-      </w:r>
-    </w:p>
-    <w:p>
-      <w:pPr>
-        <w:spacing w:after="60"/>
-      </w:pPr>
-      <w:r>
-        <w:t xml:space="preserve">• desptopCapturer / getDisplayMedia — захват экрана (Windows)</w:t>
-      </w:r>
-    </w:p>
-    <w:p>
-      <w:pPr>
-        <w:spacing w:after="60"/>
-      </w:pPr>
-      <w:r>
-        <w:t xml:space="preserve">• nat-upnp — автоматическое открытие портов на роутере (для LAN режима)</w:t>
-      </w:r>
-    </w:p>
-    <w:p>
-      <w:pPr>
-        <w:spacing w:after="60"/>
-      </w:pPr>
-      <w:r>
-        <w:t xml:space="preserve">• Node.js v24 — среда выполнения JavaScript</w:t>
-      </w:r>
-    </w:p>
-    <w:p>
-      <w:pPr>
-        <w:spacing w:after="60"/>
-      </w:pPr>
-      <w:r>
-        <w:t xml:space="preserve">• electron-builder 25 — сборка портативного .exe</w:t>
-      </w:r>
-    </w:p>
-    <w:p>
-      <w:pPr>
-        <w:spacing w:after="300"/>
-      </w:pPr>
-      <w:r>
-        <w:t xml:space="preserve">• docx — генерация этого документа</w:t>
-      </w:r>
-    </w:p>
-    <w:p>
-      <w:pPr>
-        <w:pStyle w:val="Heading1"/>
-      </w:pPr>
-      <w:r>
-        <w:t xml:space="preserve">3. Архитектура</w:t>
+        <w:t xml:space="preserve">Приложение имеет два режима работы: Локально (LAN) и Через Интернет (Cloud).</w:t>
+      </w:r>
+    </w:p>
+    <w:p>
+      <w:pPr>
+        <w:pStyle w:val="Heading2"/>
+      </w:pPr>
+      <w:r>
+        <w:t xml:space="preserve">Multi-user (до 5 участников):</w:t>
       </w:r>
     </w:p>
     <w:p>
@@ -165,15 +181,15 @@
         <w:spacing w:after="200"/>
       </w:pPr>
       <w:r>
-        <w:t xml:space="preserve">Приложение имеет два режима работы: Локально (LAN) и Через Интернет (Cloud).</w:t>
-      </w:r>
-    </w:p>
-    <w:p>
-      <w:pPr>
-        <w:pStyle w:val="Heading2"/>
-      </w:pPr>
-      <w:r>
-        <w:t xml:space="preserve">Multi-user (до 5 участников):</w:t>
+        <w:t xml:space="preserve">Используется mesh-топология — каждый клиент создаёт отдельный RTCPeerConnection для каждого участника. Все участники соединяются напрямую друг с другом (P2P). Новый участник рассылает user-joined всем в комнате, каждый существующий создаёт offer. Screen sharing транслируется всем участникам.</w:t>
+      </w:r>
+    </w:p>
+    <w:p>
+      <w:pPr>
+        <w:pStyle w:val="Heading2"/>
+      </w:pPr>
+      <w:r>
+        <w:t xml:space="preserve">3.1. Локальный режим</w:t>
       </w:r>
     </w:p>
     <w:p>
@@ -181,15 +197,15 @@
         <w:spacing w:after="200"/>
       </w:pPr>
       <w:r>
-        <w:t xml:space="preserve">Используется mesh-топология — каждый клиент создаёт отдельный RTCPeerConnection для каждого участника. Все участники соединяются напрямую друг с другом (P2P). Новый участник рассылает user-joined всем в комнате, каждый существующий создаёт offer. Screen sharing транслируется всем участникам.</w:t>
-      </w:r>
-    </w:p>
-    <w:p>
-      <w:pPr>
-        <w:pStyle w:val="Heading2"/>
-      </w:pPr>
-      <w:r>
-        <w:t xml:space="preserve">3.1. Локальный режим</w:t>
+        <w:t xml:space="preserve">На ПК хоста запускается встроенный Socket.IO сервер на порту 3000 (или 3001, 3002... если занят). Гость подключается напрямую к хосту по его локальному IP. Все сигналы идут напрямую между ПК через локальную сеть. UPnP пытается открыть порт на роутере для внешнего доступа.</w:t>
+      </w:r>
+    </w:p>
+    <w:p>
+      <w:pPr>
+        <w:pStyle w:val="Heading2"/>
+      </w:pPr>
+      <w:r>
+        <w:t xml:space="preserve">3.2. Облачный режим</w:t>
       </w:r>
     </w:p>
     <w:p>
@@ -197,15 +213,15 @@
         <w:spacing w:after="200"/>
       </w:pPr>
       <w:r>
-        <w:t xml:space="preserve">На ПК хоста запускается встроенный Socket.IO сервер на порту 3000 (или 3001, 3002... если занят). Гость подключается напрямую к хосту по его локальному IP. Все сигналы идут напрямую между ПК через локальную сеть. UPnP пытается открыть порт на роутере для внешнего доступа.</w:t>
-      </w:r>
-    </w:p>
-    <w:p>
-      <w:pPr>
-        <w:pStyle w:val="Heading2"/>
-      </w:pPr>
-      <w:r>
-        <w:t xml:space="preserve">3.2. Облачный режим</w:t>
+        <w:t xml:space="preserve">Оба ПК подключаются к облачному сигнальному серверу на Render.com. Сервер только пересылает служебные сообщения. Видео и аудио передаются напрямую между ПК (P2P) через WebRTC и STUN серверы Google. Облачный сервер не участвует в передаче медиа.</w:t>
+      </w:r>
+    </w:p>
+    <w:p>
+      <w:pPr>
+        <w:pStyle w:val="Heading2"/>
+      </w:pPr>
+      <w:r>
+        <w:t xml:space="preserve">3.3. Плавающая панель при трансляции</w:t>
       </w:r>
     </w:p>
     <w:p>
@@ -213,15 +229,15 @@
         <w:spacing w:after="200"/>
       </w:pPr>
       <w:r>
-        <w:t xml:space="preserve">Оба ПК подключаются к облачному сигнальному серверу на Render.com. Сервер только пересылает служебные сообщения. Видео и аудио передаются напрямую между ПК (P2P) через WebRTC и STUN серверы Google. Облачный сервер не участвует в передаче медиа.</w:t>
-      </w:r>
-    </w:p>
-    <w:p>
-      <w:pPr>
-        <w:pStyle w:val="Heading2"/>
-      </w:pPr>
-      <w:r>
-        <w:t xml:space="preserve">3.3. Плавающая панель при трансляции</w:t>
+        <w:t xml:space="preserve">При старте трансляции экрана создаётся frameless-окно 310×78 (panel.html/panel.js) с always-on-top (уровень screen-saver). Кнопки 48×48 с SVG-иконками: камера, микрофон, рация (PTT), экран, выход. Состояние обновляется через IPC bridge каждые 500 мс. Правый клик по микрофону — переключение в режим PTT.</w:t>
+      </w:r>
+    </w:p>
+    <w:p>
+      <w:pPr>
+        <w:pStyle w:val="Heading2"/>
+      </w:pPr>
+      <w:r>
+        <w:t xml:space="preserve">3.4. Окно камер участников (faces)</w:t>
       </w:r>
     </w:p>
     <w:p>
@@ -229,15 +245,31 @@
         <w:spacing w:after="200"/>
       </w:pPr>
       <w:r>
-        <w:t xml:space="preserve">При старте трансляции экрана создаётся отдельное frameless-окно 260×56 с прозрачным фоном и always-on-top. Панель содержит только кнопки управления (камера, микрофон, рация, экран, выход) с теми же SVG-иконками, что в главном окне. Состояние обновляется через IPC каждые 500 мс. При остановке трансляции панель закрывается.</w:t>
-      </w:r>
-    </w:p>
-    <w:p>
-      <w:pPr>
-        <w:pStyle w:val="Heading2"/>
-      </w:pPr>
-      <w:r>
-        <w:t xml:space="preserve">3.4. Схема</w:t>
+        <w:t xml:space="preserve">Третье BrowserWindow 300×220, bottom-right, always-on-top, с заголовком. Показывает canvas-кадры камер всех участников (отправляются через IPC, ~5 fps). Ползунки громкости для каждого. Качество связи: цветная точка (зелёный/жёлтый/красный/серый). Создаётся при старте трансляции, закрывается при остановке.</w:t>
+      </w:r>
+    </w:p>
+    <w:p>
+      <w:pPr>
+        <w:pStyle w:val="Heading2"/>
+      </w:pPr>
+      <w:r>
+        <w:t xml:space="preserve">3.5. Чат и реакции</w:t>
+      </w:r>
+    </w:p>
+    <w:p>
+      <w:pPr>
+        <w:spacing w:after="200"/>
+      </w:pPr>
+      <w:r>
+        <w:t xml:space="preserve">Текстовый чат работает через три IPC-канала (main-chat-send, panel-chat-send, forward-chat). Emoji-реакции на весь экран — анимированные взлетающие эмодзи. Скример-пасхалка: команда /скример в чате показывает пугающую картинку со звуком всем участникам.</w:t>
+      </w:r>
+    </w:p>
+    <w:p>
+      <w:pPr>
+        <w:pStyle w:val="Heading2"/>
+      </w:pPr>
+      <w:r>
+        <w:t xml:space="preserve">3.6. Схема</w:t>
       </w:r>
     </w:p>
     <w:p>
@@ -249,9 +281,11 @@
      │                                        │
      └── сигналы (Socket.IO) ——→ Render.com ——→──┘
 (только в облачном режиме; в локальном сигналы идут напрямую)
-ПК1 (шарер) ←—— IPC —→ Плавающая панель (always-on-top)
+ПК1 (шарер) ←—— IPC —→ Плавающая панель (always-on-top screen-saver)
     │
-    └—— WebRTC screen stream —→ ПК2 (зритель)</w:t>
+    ├—— WebRTC screen stream —→ ПК2 (зритель)
+    │
+    └—— IPC canvas (5 fps) —→ Окно камер (faces)</w:t>
       </w:r>
     </w:p>
     <w:p>
@@ -395,23 +429,63 @@
         <w:spacing w:after="60"/>
       </w:pPr>
       <w:r>
-        <w:t xml:space="preserve">renderer/panel.html — HTML плавающей панели (кнопки с SVG-иконками)</w:t>
-      </w:r>
-    </w:p>
-    <w:p>
-      <w:pPr>
-        <w:spacing w:after="60"/>
-      </w:pPr>
-      <w:r>
-        <w:t xml:space="preserve">renderer/panel.js — JavaScript плавающей панели (IPC, состояние кнопок)</w:t>
-      </w:r>
-    </w:p>
-    <w:p>
-      <w:pPr>
-        <w:spacing w:after="60"/>
-      </w:pPr>
-      <w:r>
-        <w:t xml:space="preserve">renderer/i18n.js — Строки перевода RU/EN, функции t()/setLang()/initLang()</w:t>
+        <w:t xml:space="preserve">renderer/panel.html — HTML плавающей панели (кнопки 48×48 с SVG-иконками)</w:t>
+      </w:r>
+    </w:p>
+    <w:p>
+      <w:pPr>
+        <w:spacing w:after="60"/>
+      </w:pPr>
+      <w:r>
+        <w:t xml:space="preserve">renderer/panel.js — JavaScript плавающей панели (IPC bridge, PTT, состояние)</w:t>
+      </w:r>
+    </w:p>
+    <w:p>
+      <w:pPr>
+        <w:spacing w:after="60"/>
+      </w:pPr>
+      <w:r>
+        <w:t xml:space="preserve">renderer/faces.html — HTML окна камер участников</w:t>
+      </w:r>
+    </w:p>
+    <w:p>
+      <w:pPr>
+        <w:spacing w:after="60"/>
+      </w:pPr>
+      <w:r>
+        <w:t xml:space="preserve">renderer/faces.js — JavaScript окна камер (canvas-кадры, ползунки громкости, качество)</w:t>
+      </w:r>
+    </w:p>
+    <w:p>
+      <w:pPr>
+        <w:spacing w:after="60"/>
+      </w:pPr>
+      <w:r>
+        <w:t xml:space="preserve">renderer/reactions.js — Emoji-реакции на весь экран</w:t>
+      </w:r>
+    </w:p>
+    <w:p>
+      <w:pPr>
+        <w:spacing w:after="60"/>
+      </w:pPr>
+      <w:r>
+        <w:t xml:space="preserve">renderer/scrimer.html — Страница скримера (пасхалка)</w:t>
+      </w:r>
+    </w:p>
+    <w:p>
+      <w:pPr>
+        <w:spacing w:after="60"/>
+      </w:pPr>
+      <w:r>
+        <w:t xml:space="preserve">renderer/scrimer/ — PNG-картинки и MP3 для скримера</w:t>
+      </w:r>
+    </w:p>
+    <w:p>
+      <w:pPr>
+        <w:spacing w:after="60"/>
+      </w:pPr>
+      <w:r>
+        <w:t xml:space="preserve">renderer/i18n.js — Строки перевода RU/EN/ES, функции t()/setLang()/initLang()</w:t>
       </w:r>
     </w:p>
     <w:p>
@@ -427,15 +501,31 @@
         <w:spacing w:after="60"/>
       </w:pPr>
       <w:r>
-        <w:t xml:space="preserve">server/cloud.js — Облачный signalling сервер для Render.com</w:t>
-      </w:r>
-    </w:p>
-    <w:p>
-      <w:pPr>
-        <w:spacing w:after="60"/>
-      </w:pPr>
-      <w:r>
-        <w:t xml:space="preserve">server/package.json — Зависимости для облачного сервера (только socket.io)</w:t>
+        <w:t xml:space="preserve">bot/index.js — Telegram бот + облачный signalling сервер (Render.com)</w:t>
+      </w:r>
+    </w:p>
+    <w:p>
+      <w:pPr>
+        <w:spacing w:after="60"/>
+      </w:pPr>
+      <w:r>
+        <w:t xml:space="preserve">bot/package.json — Зависимости для бота (socket.io, node-telegram-bot-api)</w:t>
+      </w:r>
+    </w:p>
+    <w:p>
+      <w:pPr>
+        <w:spacing w:after="60"/>
+      </w:pPr>
+      <w:r>
+        <w:t xml:space="preserve">.github/workflows/release-to-telegram.yml — CI: уведомления о релизах в Telegram</w:t>
+      </w:r>
+    </w:p>
+    <w:p>
+      <w:pPr>
+        <w:spacing w:after="60"/>
+      </w:pPr>
+      <w:r>
+        <w:t xml:space="preserve">.github/send_telegram.py — Python-скрипт отправки релизных уведомлений</w:t>
       </w:r>
     </w:p>
     <w:p>
@@ -475,7 +565,15 @@
         <w:pStyle w:val="Heading1"/>
       </w:pPr>
       <w:r>
-        <w:t xml:space="preserve">5. Облачный сервер (Render.com)</w:t>
+        <w:t xml:space="preserve">5. Облачный сервер и Telegram бот (Render.com)</w:t>
+      </w:r>
+    </w:p>
+    <w:p>
+      <w:pPr>
+        <w:spacing w:after="200"/>
+      </w:pPr>
+      <w:r>
+        <w:t xml:space="preserve">Все серверные функции объединены в bot/index.js на Render.com.</w:t>
       </w:r>
     </w:p>
     <w:p>
@@ -483,7 +581,47 @@
         <w:spacing w:after="100"/>
       </w:pPr>
       <w:r>
-        <w:t xml:space="preserve">Адрес: https://hamsters-theater-cloud.onrender.com</w:t>
+        <w:t xml:space="preserve">Адрес: https://tv-hamsters-bot.onrender.com</w:t>
+      </w:r>
+    </w:p>
+    <w:p>
+      <w:pPr>
+        <w:pStyle w:val="Heading2"/>
+      </w:pPr>
+      <w:r>
+        <w:t xml:space="preserve">5.1. Что делает сервер</w:t>
+      </w:r>
+    </w:p>
+    <w:p>
+      <w:pPr>
+        <w:spacing w:after="40"/>
+      </w:pPr>
+      <w:r>
+        <w:t xml:space="preserve">• Сигналинг Socket.IO (create-room, join-room, offer, answer, ice-candidate, signal, chat-message, reaction)</w:t>
+      </w:r>
+    </w:p>
+    <w:p>
+      <w:pPr>
+        <w:spacing w:after="40"/>
+      </w:pPr>
+      <w:r>
+        <w:t xml:space="preserve">• Telegram бот (node-telegram-bot-api): команды /start, /room, /help, /download</w:t>
+      </w:r>
+    </w:p>
+    <w:p>
+      <w:pPr>
+        <w:spacing w:after="40"/>
+      </w:pPr>
+      <w:r>
+        <w:t xml:space="preserve">• Автосоздание комнаты при ключевых словах в групповых чатах</w:t>
+      </w:r>
+    </w:p>
+    <w:p>
+      <w:pPr>
+        <w:spacing w:after="40"/>
+      </w:pPr>
+      <w:r>
+        <w:t xml:space="preserve">• Keep-alive ping каждые 10 минут (для предотвращения засыпания на бесплатном тарифе Render)</w:t>
       </w:r>
     </w:p>
     <w:p>
@@ -491,15 +629,63 @@
         <w:spacing w:after="200"/>
       </w:pPr>
       <w:r>
-        <w:t xml:space="preserve">Репозиторий: https://github.com/outmilker1978/hamsters-theater-cloud</w:t>
-      </w:r>
-    </w:p>
-    <w:p>
-      <w:pPr>
-        <w:pStyle w:val="Heading2"/>
-      </w:pPr>
-      <w:r>
-        <w:t xml:space="preserve">5.1. Что делает облачный сервер</w:t>
+        <w:t xml:space="preserve">ВАЖНО: для обратной совместимости сервер дублирует peer-joined как user-joined. Старые и новые клиенты должны работать вместе.</w:t>
+      </w:r>
+    </w:p>
+    <w:p>
+      <w:pPr>
+        <w:pStyle w:val="Heading2"/>
+      </w:pPr>
+      <w:r>
+        <w:t xml:space="preserve">5.2. Как поддерживать</w:t>
+      </w:r>
+    </w:p>
+    <w:p>
+      <w:pPr>
+        <w:spacing w:after="40"/>
+      </w:pPr>
+      <w:r>
+        <w:t xml:space="preserve">1. Зайти в https://dashboard.render.com</w:t>
+      </w:r>
+    </w:p>
+    <w:p>
+      <w:pPr>
+        <w:spacing w:after="40"/>
+      </w:pPr>
+      <w:r>
+        <w:t xml:space="preserve">2. Войти через GitHub (outmilker1978)</w:t>
+      </w:r>
+    </w:p>
+    <w:p>
+      <w:pPr>
+        <w:spacing w:after="40"/>
+      </w:pPr>
+      <w:r>
+        <w:t xml:space="preserve">3. Выбрать Web Service "tv-hamsters-bot"</w:t>
+      </w:r>
+    </w:p>
+    <w:p>
+      <w:pPr>
+        <w:spacing w:after="40"/>
+      </w:pPr>
+      <w:r>
+        <w:t xml:space="preserve">4. Там можно:</w:t>
+      </w:r>
+    </w:p>
+    <w:p>
+      <w:pPr>
+        <w:spacing w:after="40"/>
+      </w:pPr>
+      <w:r>
+        <w:t xml:space="preserve">   • Посмотреть логи (Logs)</w:t>
+      </w:r>
+    </w:p>
+    <w:p>
+      <w:pPr>
+        <w:spacing w:after="40"/>
+      </w:pPr>
+      <w:r>
+        <w:t xml:space="preserve">   • Перезапустить (Manual Deploy → Deploy)</w:t>
       </w:r>
     </w:p>
     <w:p>
@@ -507,47 +693,7 @@
         <w:spacing w:after="100"/>
       </w:pPr>
       <w:r>
-        <w:t xml:space="preserve">Сервер реализован в файле server/cloud.js. Его единственная задача — пересылать сигнальные сообщения между клиентами:</w:t>
-      </w:r>
-    </w:p>
-    <w:p>
-      <w:pPr>
-        <w:spacing w:after="40"/>
-      </w:pPr>
-      <w:r>
-        <w:t xml:space="preserve">• create-room / room-created — создание комнаты с 4-значным PIN</w:t>
-      </w:r>
-    </w:p>
-    <w:p>
-      <w:pPr>
-        <w:spacing w:after="40"/>
-      </w:pPr>
-      <w:r>
-        <w:t xml:space="preserve">• join-room / joined / room-users / user-joined — подключение к комнате (multi-user)</w:t>
-      </w:r>
-    </w:p>
-    <w:p>
-      <w:pPr>
-        <w:spacing w:after="40"/>
-      </w:pPr>
-      <w:r>
-        <w:t xml:space="preserve">• offer / answer — обмен SDP (WebRTC)</w:t>
-      </w:r>
-    </w:p>
-    <w:p>
-      <w:pPr>
-        <w:spacing w:after="40"/>
-      </w:pPr>
-      <w:r>
-        <w:t xml:space="preserve">• ice-candidate — передача ICE кандидатов</w:t>
-      </w:r>
-    </w:p>
-    <w:p>
-      <w:pPr>
-        <w:spacing w:after="40"/>
-      </w:pPr>
-      <w:r>
-        <w:t xml:space="preserve">• signal — передача прикладных сигналов (screen-started/stopped, request-offer)</w:t>
+        <w:t xml:space="preserve">   • Обновить код (если изменить server/cloud.js в GitHub и push — Render перезапустит сам)</w:t>
       </w:r>
     </w:p>
     <w:p>
@@ -555,71 +701,15 @@
         <w:spacing w:after="200"/>
       </w:pPr>
       <w:r>
-        <w:t xml:space="preserve">• disconnect — очистка комнаты при отключении</w:t>
-      </w:r>
-    </w:p>
-    <w:p>
-      <w:pPr>
-        <w:spacing w:after="200"/>
-      </w:pPr>
-      <w:r>
-        <w:t xml:space="preserve">ВАЖНО: для обратной совместимости сервер дублирует peer-joined как user-joined. Старые и новые клиенты должны работать вместе.</w:t>
-      </w:r>
-    </w:p>
-    <w:p>
-      <w:pPr>
-        <w:pStyle w:val="Heading2"/>
-      </w:pPr>
-      <w:r>
-        <w:t xml:space="preserve">5.2. Как поддерживать</w:t>
-      </w:r>
-    </w:p>
-    <w:p>
-      <w:pPr>
-        <w:spacing w:after="40"/>
-      </w:pPr>
-      <w:r>
-        <w:t xml:space="preserve">1. Зайти в https://dashboard.render.com</w:t>
-      </w:r>
-    </w:p>
-    <w:p>
-      <w:pPr>
-        <w:spacing w:after="40"/>
-      </w:pPr>
-      <w:r>
-        <w:t xml:space="preserve">2. Войти через GitHub (outmilker1978)</w:t>
-      </w:r>
-    </w:p>
-    <w:p>
-      <w:pPr>
-        <w:spacing w:after="40"/>
-      </w:pPr>
-      <w:r>
-        <w:t xml:space="preserve">3. Выбрать Web Service "hamsters-theater-cloud"</w:t>
-      </w:r>
-    </w:p>
-    <w:p>
-      <w:pPr>
-        <w:spacing w:after="40"/>
-      </w:pPr>
-      <w:r>
-        <w:t xml:space="preserve">4. Там можно:</w:t>
-      </w:r>
-    </w:p>
-    <w:p>
-      <w:pPr>
-        <w:spacing w:after="40"/>
-      </w:pPr>
-      <w:r>
-        <w:t xml:space="preserve">   • Посмотреть логи (Logs)</w:t>
-      </w:r>
-    </w:p>
-    <w:p>
-      <w:pPr>
-        <w:spacing w:after="40"/>
-      </w:pPr>
-      <w:r>
-        <w:t xml:space="preserve">   • Перезапустить (Manual Deploy → Deploy)</w:t>
+        <w:t xml:space="preserve">Важно: Render бесплатный, но сервер "засыпает" после 15 минут бездействия. При новом подключении просыпается за 5-15 секунд. Для постоянной работы (без засыпания) нужен платный тариф — $7/мес.</w:t>
+      </w:r>
+    </w:p>
+    <w:p>
+      <w:pPr>
+        <w:pStyle w:val="Heading2"/>
+      </w:pPr>
+      <w:r>
+        <w:t xml:space="preserve">5.3. Как обновить URL в приложении</w:t>
       </w:r>
     </w:p>
     <w:p>
@@ -627,23 +717,63 @@
         <w:spacing w:after="100"/>
       </w:pPr>
       <w:r>
-        <w:t xml:space="preserve">   • Обновить код (если изменить server/cloud.js в GitHub и push — Render перезапустит сам)</w:t>
-      </w:r>
-    </w:p>
-    <w:p>
-      <w:pPr>
-        <w:spacing w:after="200"/>
-      </w:pPr>
-      <w:r>
-        <w:t xml:space="preserve">Важно: Render бесплатный, но сервер "засыпает" после 15 минут бездействия. При новом подключении просыпается за 5-15 секунд. Для постоянной работы (без засыпания) нужен платный тариф — $7/мес.</w:t>
-      </w:r>
-    </w:p>
-    <w:p>
-      <w:pPr>
-        <w:pStyle w:val="Heading2"/>
-      </w:pPr>
-      <w:r>
-        <w:t xml:space="preserve">5.3. Как обновить URL в приложении</w:t>
+        <w:t xml:space="preserve">URL облачного сервера задаётся:</w:t>
+      </w:r>
+    </w:p>
+    <w:p>
+      <w:pPr>
+        <w:spacing w:after="40"/>
+      </w:pPr>
+      <w:r>
+        <w:t xml:space="preserve">• bot/index.js — токен Telegram бота и порт</w:t>
+      </w:r>
+    </w:p>
+    <w:p>
+      <w:pPr>
+        <w:spacing w:after="40"/>
+      </w:pPr>
+      <w:r>
+        <w:t xml:space="preserve">• renderer/app.js — начальное значение CLOUD_SERVER_URL (через IPC из main.js)</w:t>
+      </w:r>
+    </w:p>
+    <w:p>
+      <w:pPr>
+        <w:spacing w:after="40"/>
+      </w:pPr>
+      <w:r>
+        <w:t xml:space="preserve">• docs/mobile/app.js — константа CLOUD для мобильной версии</w:t>
+      </w:r>
+    </w:p>
+    <w:p>
+      <w:pPr>
+        <w:pStyle w:val="Heading1"/>
+      </w:pPr>
+      <w:r>
+        <w:t xml:space="preserve">6. Сборка .exe</w:t>
+      </w:r>
+    </w:p>
+    <w:p>
+      <w:pPr>
+        <w:spacing w:after="60"/>
+      </w:pPr>
+      <w:r>
+        <w:t xml:space="preserve">Требования:</w:t>
+      </w:r>
+    </w:p>
+    <w:p>
+      <w:pPr>
+        <w:spacing w:after="40"/>
+      </w:pPr>
+      <w:r>
+        <w:t xml:space="preserve">• Node.js v24 (установлен в C:\Program Files\nodejs)</w:t>
+      </w:r>
+    </w:p>
+    <w:p>
+      <w:pPr>
+        <w:spacing w:after="40"/>
+      </w:pPr>
+      <w:r>
+        <w:t xml:space="preserve">• npm 11 (входит в Node.js)</w:t>
       </w:r>
     </w:p>
     <w:p>
@@ -651,63 +781,71 @@
         <w:spacing w:after="100"/>
       </w:pPr>
       <w:r>
-        <w:t xml:space="preserve">URL облачного сервера задаётся в двух местах:</w:t>
-      </w:r>
-    </w:p>
-    <w:p>
-      <w:pPr>
-        <w:spacing w:after="40"/>
-      </w:pPr>
-      <w:r>
-        <w:t xml:space="preserve">• main.js — константа CLOUD_SERVER_URL</w:t>
-      </w:r>
-    </w:p>
-    <w:p>
-      <w:pPr>
-        <w:spacing w:after="40"/>
-      </w:pPr>
-      <w:r>
-        <w:t xml:space="preserve">• renderer/app.js — начальное значение CLOUD_SERVER_URL (перезаписывается из main.js через IPC)</w:t>
-      </w:r>
-    </w:p>
-    <w:p>
-      <w:pPr>
-        <w:spacing w:after="300"/>
-      </w:pPr>
-      <w:r>
-        <w:t xml:space="preserve">При сборке .exe нужно изменить в обоих файлах, затем пересобрать.</w:t>
-      </w:r>
-    </w:p>
-    <w:p>
-      <w:pPr>
-        <w:pStyle w:val="Heading1"/>
-      </w:pPr>
-      <w:r>
-        <w:t xml:space="preserve">6. Сборка .exe</w:t>
-      </w:r>
-    </w:p>
-    <w:p>
-      <w:pPr>
-        <w:spacing w:after="60"/>
-      </w:pPr>
-      <w:r>
-        <w:t xml:space="preserve">Требования:</w:t>
-      </w:r>
-    </w:p>
-    <w:p>
-      <w:pPr>
-        <w:spacing w:after="40"/>
-      </w:pPr>
-      <w:r>
-        <w:t xml:space="preserve">• Node.js v24 (установлен в C:\Program Files\nodejs)</w:t>
-      </w:r>
-    </w:p>
-    <w:p>
-      <w:pPr>
-        <w:spacing w:after="40"/>
-      </w:pPr>
-      <w:r>
-        <w:t xml:space="preserve">• npm 11 (входит в Node.js)</w:t>
+        <w:t xml:space="preserve">• Все зависимости установлены (npm install)</w:t>
+      </w:r>
+    </w:p>
+    <w:p>
+      <w:pPr>
+        <w:pStyle w:val="Heading2"/>
+      </w:pPr>
+      <w:r>
+        <w:t xml:space="preserve">Процесс сборки:</w:t>
+      </w:r>
+    </w:p>
+    <w:p>
+      <w:pPr>
+        <w:spacing w:after="40"/>
+      </w:pPr>
+      <w:r>
+        <w:t xml:space="preserve">npm run build</w:t>
+      </w:r>
+    </w:p>
+    <w:p>
+      <w:pPr>
+        <w:spacing w:after="40"/>
+      </w:pPr>
+      <w:r>
+        <w:t xml:space="preserve">• prebuild: старый .exe из dist/ перемещается в dist/Archive/</w:t>
+      </w:r>
+    </w:p>
+    <w:p>
+      <w:pPr>
+        <w:spacing w:after="40"/>
+      </w:pPr>
+      <w:r>
+        <w:t xml:space="preserve">• electron-builder упаковывает app.asar в dist/win-unpacked/</w:t>
+      </w:r>
+    </w:p>
+    <w:p>
+      <w:pPr>
+        <w:spacing w:after="60"/>
+      </w:pPr>
+      <w:r>
+        <w:t xml:space="preserve">• Ошибка winCodeSign про симлинки — НЕ КРИТИЧНА (только подпись кода, не влияет на portable). packaging (appOutDir) уже прошёл к этому моменту.</w:t>
+      </w:r>
+    </w:p>
+    <w:p>
+      <w:pPr>
+        <w:spacing w:after="60"/>
+      </w:pPr>
+      <w:r>
+        <w:t xml:space="preserve">⚠ ВАЖНО: --prepackaged НЕ обновляет код — он перепаковывает уже существующий dist/win-unpacked. Всегда делайте полную сборку перед portable:</w:t>
+      </w:r>
+    </w:p>
+    <w:p>
+      <w:pPr>
+        <w:spacing w:after="40"/>
+      </w:pPr>
+      <w:r>
+        <w:t xml:space="preserve">npx electron-builder --prepackaged dist\win-unpacked --win portable</w:t>
+      </w:r>
+    </w:p>
+    <w:p>
+      <w:pPr>
+        <w:spacing w:after="60"/>
+      </w:pPr>
+      <w:r>
+        <w:t xml:space="preserve">Проверяйте: (Get-Item dist\TV.Hamsters.*.exe).LastWriteTime должен быть после последнего изменения кода.</w:t>
       </w:r>
     </w:p>
     <w:p>
@@ -715,63 +853,7 @@
         <w:spacing w:after="100"/>
       </w:pPr>
       <w:r>
-        <w:t xml:space="preserve">• Все зависимости установлены (npm install)</w:t>
-      </w:r>
-    </w:p>
-    <w:p>
-      <w:pPr>
-        <w:pStyle w:val="Heading2"/>
-      </w:pPr>
-      <w:r>
-        <w:t xml:space="preserve">Процесс сборки:</w:t>
-      </w:r>
-    </w:p>
-    <w:p>
-      <w:pPr>
-        <w:spacing w:after="40"/>
-      </w:pPr>
-      <w:r>
-        <w:t xml:space="preserve">npm run build</w:t>
-      </w:r>
-    </w:p>
-    <w:p>
-      <w:pPr>
-        <w:spacing w:after="40"/>
-      </w:pPr>
-      <w:r>
-        <w:t xml:space="preserve">• prebuild: старый .exe из dist/ перемещается в dist/Archive/</w:t>
-      </w:r>
-    </w:p>
-    <w:p>
-      <w:pPr>
-        <w:spacing w:after="40"/>
-      </w:pPr>
-      <w:r>
-        <w:t xml:space="preserve">• electron-builder упаковывает app.asar в dist/win-unpacked/</w:t>
-      </w:r>
-    </w:p>
-    <w:p>
-      <w:pPr>
-        <w:spacing w:after="60"/>
-      </w:pPr>
-      <w:r>
-        <w:t xml:space="preserve">• Ошибка winCodeSign про симлинки — НЕ КРИТИЧНА (только подпись кода, не влияет на portable)</w:t>
-      </w:r>
-    </w:p>
-    <w:p>
-      <w:pPr>
-        <w:spacing w:after="40"/>
-      </w:pPr>
-      <w:r>
-        <w:t xml:space="preserve">Сборка портативного .exe (из подготовленного ht-win):</w:t>
-      </w:r>
-    </w:p>
-    <w:p>
-      <w:pPr>
-        <w:spacing w:after="60"/>
-      </w:pPr>
-      <w:r>
-        <w:t xml:space="preserve">npx electron-builder --prepackaged "C:\Users\Hamster\AppData\Local\Temp\ht-win" --win portable</w:t>
+        <w:t xml:space="preserve">Результат: dist\TV Hamsters X.X.X.exe (autoname, новый номер при каждой сборке — для обхода Windows Defender)</w:t>
       </w:r>
     </w:p>
     <w:p>
@@ -779,15 +861,63 @@
         <w:spacing w:after="100"/>
       </w:pPr>
       <w:r>
-        <w:t xml:space="preserve">Результат: dist\TV Hamsters X.X.X.exe</w:t>
-      </w:r>
-    </w:p>
-    <w:p>
-      <w:pPr>
-        <w:spacing w:after="200"/>
-      </w:pPr>
-      <w:r>
         <w:t xml:space="preserve">ВАЖНО: Старый .exe автоматически архивируется (prebuild). Новое имя файла с версией помогает избежать блокировки Windows Defender. Если Defender блокирует — используйте очередной новый номер версии.</w:t>
+      </w:r>
+    </w:p>
+    <w:p>
+      <w:pPr>
+        <w:pStyle w:val="Heading2"/>
+      </w:pPr>
+      <w:r>
+        <w:t xml:space="preserve">6.1. Известные проблемы</w:t>
+      </w:r>
+    </w:p>
+    <w:p>
+      <w:pPr>
+        <w:spacing w:after="40"/>
+      </w:pPr>
+      <w:r>
+        <w:t xml:space="preserve">• let vs var между скриптами — каждый &lt;script&gt; в Electron — отдельный scope. Переменная через let не видна между скриптами. Используйте var для кросс-скриптовых переменных (currentLang, peers и т.д.).</w:t>
+      </w:r>
+    </w:p>
+    <w:p>
+      <w:pPr>
+        <w:spacing w:after="40"/>
+      </w:pPr>
+      <w:r>
+        <w:t xml:space="preserve">• Screen share freeze — когда источник свёрнут, Chromium может не обновлять кадры. Ограничение браузера, не лечится.</w:t>
+      </w:r>
+    </w:p>
+    <w:p>
+      <w:pPr>
+        <w:spacing w:after="40"/>
+      </w:pPr>
+      <w:r>
+        <w:t xml:space="preserve">• Yandex Browser — встроенный VPN/Turbo ломает P2P (STUN не видит реальный IP). Chrome без прокси — лучший вариант.</w:t>
+      </w:r>
+    </w:p>
+    <w:p>
+      <w:pPr>
+        <w:spacing w:after="40"/>
+      </w:pPr>
+      <w:r>
+        <w:t xml:space="preserve">• WiFi роутеры — mesh-топология (5 участников = до 10 PC × N UDP портов) нагружает NAT-таблицу. Переключение одного участника на 4G/5G снижает нагрузку.</w:t>
+      </w:r>
+    </w:p>
+    <w:p>
+      <w:pPr>
+        <w:spacing w:after="40"/>
+      </w:pPr>
+      <w:r>
+        <w:t xml:space="preserve">• winCodeSign-2.6.0.7z extraction fails — Cannot create symbolic link (libcrypto.dylib/libssl.dylib для macOS на Windows). Не влияет на сборку — packaging проходит, portable собирается.</w:t>
+      </w:r>
+    </w:p>
+    <w:p>
+      <w:pPr>
+        <w:spacing w:after="40"/>
+      </w:pPr>
+      <w:r>
+        <w:t xml:space="preserve">• Модалки i18n — статичны в HTML (display: none), перевод только при вызове setLang(currentLang) при открытии.</w:t>
       </w:r>
     </w:p>
     <w:p>
@@ -944,15 +1074,31 @@
         <w:spacing w:after="40"/>
       </w:pPr>
       <w:r>
-        <w:t xml:space="preserve">1.7.1 — Переименование в TV Hamsters. Исправление эха (applyConstraints-gain вместо AudioContext). Увеличен размер окна до 480×680. Ползунок громкости микрофона на панели лиц. Исправлены кнопки панели, PTT с панели, кодировка PowerShell, flex-wrap для 5 камер, модалка 3 колонки, авто-восстановление свёрнутых окон</w:t>
-      </w:r>
-    </w:p>
-    <w:p>
-      <w:pPr>
-        <w:spacing w:after="40"/>
-      </w:pPr>
-      <w:r>
-        <w:t xml:space="preserve">1.7.2 — «Палата №» вместо «Код комнаты». Сценарии использования в модалке О программе. Deep-link протокол hamsters://. Ссылка на донаты (Boosty) в программе.</w:t>
+        <w:t xml:space="preserve">1.8.2 — Испанский язык (Español). Оптимизация видео/аудио (32k, 960×540). Индикатор качества связи (цветная точка). Скример-пасхалка (/скример). Чат-уведомления при трансляции. Авто ICE restart при плохом качестве. Совместимость с Celeron.</w:t>
+      </w:r>
+    </w:p>
+    <w:p>
+      <w:pPr>
+        <w:spacing w:after="40"/>
+      </w:pPr>
+      <w:r>
+        <w:t xml:space="preserve">1.8.0 — Плавающие окна, frameless drag, middle-click сброс. Реакции на весь экран. Три IPC-канала чата. EN-перевод (var). PTT правый клик. Полное нагрузочное тестирование.</w:t>
+      </w:r>
+    </w:p>
+    <w:p>
+      <w:pPr>
+        <w:spacing w:after="40"/>
+      </w:pPr>
+      <w:r>
+        <w:t xml:space="preserve">1.7.2 — «Палата №» вместо «Код комнаты». Сценарии использования. Deep-link hamsters://. Ссылка на донаты (Boosty).</w:t>
+      </w:r>
+    </w:p>
+    <w:p>
+      <w:pPr>
+        <w:spacing w:after="40"/>
+      </w:pPr>
+      <w:r>
+        <w:t xml:space="preserve">1.7.1 — Переименование в TV Hamsters. Исправление эха. Размер окна 480×680. Ползунок громкости микрофона. PTT с панели, flex-wrap 5 камер, модалка 3 колонки, авто-восстановление окон</w:t>
       </w:r>
     </w:p>
     <w:p>

</xml_diff>